<commit_message>
docs: update operator Word guide to current order flows
Co-authored-by: Miroslav Pěček <GringoOG@users.noreply.github.com>
</commit_message>
<xml_diff>
--- a/Objednavky-pro-provozovatele-onlineskoleni.docx
+++ b/Objednavky-pro-provozovatele-onlineskoleni.docx
@@ -5,7 +5,6 @@
     <w:p>
       <w:pPr>
         <w:pStyle w:val="Title"/>
-        <w:jc w:val="left"/>
       </w:pPr>
       <w:r>
         <w:t>Objednávky a školení</w:t>
@@ -22,7 +21,7 @@
     </w:p>
     <w:p>
       <w:r>
-        <w:t>Krátký přehled: jak fungují automatické objednávky od zákazníků, ruční objednávky v administraci a kdy se lidem odesílají přístupy do školení.</w:t>
+        <w:t>Aktuální přehled, jak funguje web: automatické objednávky od zákazníků, ruční objednávky v administraci, e-maily pro vás i pro účastníky a kdy se posílají přístupy do školení.</w:t>
       </w:r>
     </w:p>
     <w:p>
@@ -94,7 +93,7 @@
         <w:pStyle w:val="Heading1"/>
       </w:pPr>
       <w:r>
-        <w:t>2. Kdy se odešlou přístupy do školení</w:t>
+        <w:t>2. Kdy se odešlou přístupy do školení (účastníkům)</w:t>
       </w:r>
     </w:p>
     <w:tbl>
@@ -229,7 +228,207 @@
         <w:pStyle w:val="Heading1"/>
       </w:pPr>
       <w:r>
-        <w:t>3. Jak pracovat s ruční objednávkou (admin)</w:t>
+        <w:t>3. Jaké e-maily dostanete VY (info@onlineskoleni.eu)</w:t>
+      </w:r>
+    </w:p>
+    <w:p>
+      <w:r>
+        <w:t>Notifikace chodí na info@onlineskoleni.eu (nebo na e-mail nastavený v ORDER_NOTIFY_EMAIL).</w:t>
+      </w:r>
+    </w:p>
+    <w:tbl>
+      <w:tblPr>
+        <w:tblStyle w:val="TableGrid"/>
+        <w:tblW w:type="auto" w:w="0"/>
+        <w:tblLook w:firstColumn="1" w:firstRow="1" w:lastColumn="0" w:lastRow="0" w:noHBand="0" w:noVBand="1" w:val="04A0"/>
+      </w:tblPr>
+      <w:tblGrid>
+        <w:gridCol w:w="4320"/>
+        <w:gridCol w:w="4320"/>
+      </w:tblGrid>
+      <w:tr>
+        <w:tc>
+          <w:tcPr>
+            <w:tcW w:type="dxa" w:w="4320"/>
+          </w:tcPr>
+          <w:p>
+            <w:r>
+              <w:rPr>
+                <w:b/>
+              </w:rPr>
+              <w:t>Situace</w:t>
+            </w:r>
+          </w:p>
+        </w:tc>
+        <w:tc>
+          <w:tcPr>
+            <w:tcW w:type="dxa" w:w="4320"/>
+          </w:tcPr>
+          <w:p>
+            <w:r>
+              <w:rPr>
+                <w:b/>
+              </w:rPr>
+              <w:t>Dostanete e-mail?</w:t>
+            </w:r>
+          </w:p>
+        </w:tc>
+      </w:tr>
+      <w:tr>
+        <w:tc>
+          <w:tcPr>
+            <w:tcW w:type="dxa" w:w="4320"/>
+          </w:tcPr>
+          <w:p>
+            <w:r>
+              <w:t>GoPay – zákazník opravdu zaplatí</w:t>
+            </w:r>
+          </w:p>
+        </w:tc>
+        <w:tc>
+          <w:tcPr>
+            <w:tcW w:type="dxa" w:w="4320"/>
+          </w:tcPr>
+          <w:p>
+            <w:r>
+              <w:t>Ano – „Zaplacená objednávka …“ (hned po platbě)</w:t>
+            </w:r>
+          </w:p>
+        </w:tc>
+      </w:tr>
+      <w:tr>
+        <w:tc>
+          <w:tcPr>
+            <w:tcW w:type="dxa" w:w="4320"/>
+          </w:tcPr>
+          <w:p>
+            <w:r>
+              <w:t>QR – zákazník jen vytvoří objednávku</w:t>
+            </w:r>
+          </w:p>
+        </w:tc>
+        <w:tc>
+          <w:tcPr>
+            <w:tcW w:type="dxa" w:w="4320"/>
+          </w:tcPr>
+          <w:p>
+            <w:r>
+              <w:t>Ano – „Nová QR objednávka …“ (hned při vytvoření: firma, položky, účastníci)</w:t>
+            </w:r>
+          </w:p>
+        </w:tc>
+      </w:tr>
+      <w:tr>
+        <w:tc>
+          <w:tcPr>
+            <w:tcW w:type="dxa" w:w="4320"/>
+          </w:tcPr>
+          <w:p>
+            <w:r>
+              <w:t>QR – vy označíte Zaplaceno</w:t>
+            </w:r>
+          </w:p>
+        </w:tc>
+        <w:tc>
+          <w:tcPr>
+            <w:tcW w:type="dxa" w:w="4320"/>
+          </w:tcPr>
+          <w:p>
+            <w:r>
+              <w:t>Ano – znovu e-mail o zaplacení + odeslání přístupů účastníkům</w:t>
+            </w:r>
+          </w:p>
+        </w:tc>
+      </w:tr>
+      <w:tr>
+        <w:tc>
+          <w:tcPr>
+            <w:tcW w:type="dxa" w:w="4320"/>
+          </w:tcPr>
+          <w:p>
+            <w:r>
+              <w:t>Ruční objednávka – jen uložíte</w:t>
+            </w:r>
+          </w:p>
+        </w:tc>
+        <w:tc>
+          <w:tcPr>
+            <w:tcW w:type="dxa" w:w="4320"/>
+          </w:tcPr>
+          <w:p>
+            <w:r>
+              <w:t>Ne (vy ji sami zakládáte)</w:t>
+            </w:r>
+          </w:p>
+        </w:tc>
+      </w:tr>
+    </w:tbl>
+    <w:p/>
+    <w:p>
+      <w:r>
+        <w:rPr>
+          <w:b/>
+        </w:rPr>
+        <w:t xml:space="preserve">QR v praxi: </w:t>
+      </w:r>
+      <w:r>
+        <w:t>Nejdřív dostanete e-mail, že někdo objednal a co si objednal. Až uvidíte platbu na účtu, v adminu kliknete Zaplaceno — tím se odešlou přístupy.</w:t>
+      </w:r>
+    </w:p>
+    <w:p>
+      <w:pPr>
+        <w:pStyle w:val="Heading1"/>
+      </w:pPr>
+      <w:r>
+        <w:t>4. QR platby – co musíte udělat VY</w:t>
+      </w:r>
+    </w:p>
+    <w:p>
+      <w:pPr>
+        <w:pStyle w:val="ListNumber"/>
+      </w:pPr>
+      <w:r>
+        <w:t>Zákazník na webu vytvoří objednávku a dostane QR / údaje k převodu.</w:t>
+      </w:r>
+    </w:p>
+    <w:p>
+      <w:pPr>
+        <w:pStyle w:val="ListNumber"/>
+      </w:pPr>
+      <w:r>
+        <w:t>Vy dostanete e-mail „Nová QR objednávka“ s detaily.</w:t>
+      </w:r>
+    </w:p>
+    <w:p>
+      <w:pPr>
+        <w:pStyle w:val="ListNumber"/>
+      </w:pPr>
+      <w:r>
+        <w:t>Objednávka v adminu čeká jako Nezaplaceno.</w:t>
+      </w:r>
+    </w:p>
+    <w:p>
+      <w:pPr>
+        <w:pStyle w:val="ListNumber"/>
+      </w:pPr>
+      <w:r>
+        <w:t>Až uvidíte platbu na účtu, v administraci ji označte Zaplaceno.</w:t>
+      </w:r>
+    </w:p>
+    <w:p>
+      <w:pPr>
+        <w:pStyle w:val="ListNumber"/>
+      </w:pPr>
+      <w:r>
+        <w:t>Systém pošle přístupy účastníkům a potvrzení na fakturační e-mail.</w:t>
+      </w:r>
+    </w:p>
+    <w:p>
+      <w:pPr>
+        <w:pStyle w:val="Heading1"/>
+      </w:pPr>
+      <w:r>
+        <w:t>5. Jak pracovat s ruční objednávkou (admin)</w:t>
       </w:r>
     </w:p>
     <w:p>
@@ -282,7 +481,7 @@
         <w:pStyle w:val="ListNumber"/>
       </w:pPr>
       <w:r>
-        <w:t>Uložte objednávku → vznikne jako Nezaplaceno.</w:t>
+        <w:t>Uložte objednávku → vznikne jako Nezaplaceno (přístupy se ještě neposílají).</w:t>
       </w:r>
     </w:p>
     <w:p>
@@ -306,52 +505,12 @@
         <w:pStyle w:val="Heading1"/>
       </w:pPr>
       <w:r>
-        <w:t>4. QR platby – co dělat vy</w:t>
-      </w:r>
-    </w:p>
-    <w:p>
-      <w:pPr>
-        <w:pStyle w:val="ListNumber"/>
-      </w:pPr>
-      <w:r>
-        <w:t>Zákazník na webu vytvoří objednávku a dostane QR / údaje k převodu.</w:t>
-      </w:r>
-    </w:p>
-    <w:p>
-      <w:pPr>
-        <w:pStyle w:val="ListNumber"/>
-      </w:pPr>
-      <w:r>
-        <w:t>Objednávka čeká jako Nezaplaceno.</w:t>
-      </w:r>
-    </w:p>
-    <w:p>
-      <w:pPr>
-        <w:pStyle w:val="ListNumber"/>
-      </w:pPr>
-      <w:r>
-        <w:t>Až uvidíte platbu na účtu, v administraci ji označte Zaplaceno.</w:t>
-      </w:r>
-    </w:p>
-    <w:p>
-      <w:pPr>
-        <w:pStyle w:val="ListNumber"/>
-      </w:pPr>
-      <w:r>
-        <w:t>Systém pošle přístupy účastníkům (stejně jako u ruční objednávky).</w:t>
-      </w:r>
-    </w:p>
-    <w:p>
-      <w:pPr>
-        <w:pStyle w:val="Heading1"/>
-      </w:pPr>
-      <w:r>
-        <w:t>5. Seznam objednávek v administraci</w:t>
+        <w:t>6. Seznam objednávek v administraci</w:t>
       </w:r>
     </w:p>
     <w:p>
       <w:r>
-        <w:t>U každé objednávky můžete přepínat:</w:t>
+        <w:t>U každé objednávky můžete:</w:t>
       </w:r>
     </w:p>
     <w:p>
@@ -359,7 +518,7 @@
         <w:pStyle w:val="ListBullet"/>
       </w:pPr>
       <w:r>
-        <w:t>Zaplaceno → spustí založení účtů LMS + odeslání uvítacích e-mailů (pokud ještě neproběhlo).</w:t>
+        <w:t>Kliknout na kartu („Zobrazit přístupy LMS“) — uvidíte všechny e-maily, na které jdou / šly přístupy do školení, včetně jména a přiřazených kurzů.</w:t>
       </w:r>
     </w:p>
     <w:p>
@@ -367,7 +526,15 @@
         <w:pStyle w:val="ListBullet"/>
       </w:pPr>
       <w:r>
-        <w:t>Nezaplaceno → objednávka čeká na platbu.</w:t>
+        <w:t>Označit Zaplaceno → založení účtů LMS + odeslání uvítacích e-mailů (pokud ještě neproběhlo).</w:t>
+      </w:r>
+    </w:p>
+    <w:p>
+      <w:pPr>
+        <w:pStyle w:val="ListBullet"/>
+      </w:pPr>
+      <w:r>
+        <w:t>Označit Nezaplaceno → objednávka čeká na platbu.</w:t>
       </w:r>
     </w:p>
     <w:p>
@@ -380,7 +547,7 @@
         <w:pStyle w:val="Heading1"/>
       </w:pPr>
       <w:r>
-        <w:t>6. Kurzy a ceny (základ)</w:t>
+        <w:t>7. Kurzy a ceny (základ)</w:t>
       </w:r>
     </w:p>
     <w:p>
@@ -417,7 +584,7 @@
         <w:pStyle w:val="Heading1"/>
       </w:pPr>
       <w:r>
-        <w:t>7. Co se stane po aktivaci (stručně)</w:t>
+        <w:t>8. Co se stane po aktivaci (stručně)</w:t>
       </w:r>
     </w:p>
     <w:p>
@@ -457,7 +624,7 @@
         <w:pStyle w:val="Heading1"/>
       </w:pPr>
       <w:r>
-        <w:t>8. Časté situace</w:t>
+        <w:t>9. Časté situace</w:t>
       </w:r>
     </w:p>
     <w:p>
@@ -504,6 +671,19 @@
         <w:rPr>
           <w:b/>
         </w:rPr>
+        <w:t>Zákazník vytvořil QR, ale ještě nezaplatil</w:t>
+      </w:r>
+    </w:p>
+    <w:p>
+      <w:r>
+        <w:t>Vy už máte e-mail o nové objednávce. Přístupy pošlete až po Zaplaceno v adminu.</w:t>
+      </w:r>
+    </w:p>
+    <w:p>
+      <w:r>
+        <w:rPr>
+          <w:b/>
+        </w:rPr>
         <w:t>Zákazník zaplatil QR, ale přístupy nechodí</w:t>
       </w:r>
     </w:p>
@@ -530,6 +710,19 @@
         <w:rPr>
           <w:b/>
         </w:rPr>
+        <w:t>Kde vidím, komu šly přístupy</w:t>
+      </w:r>
+    </w:p>
+    <w:p>
+      <w:r>
+        <w:t>V adminu klikněte na objednávku → Zobrazit přístupy LMS.</w:t>
+      </w:r>
+    </w:p>
+    <w:p>
+      <w:r>
+        <w:rPr>
+          <w:b/>
+        </w:rPr>
         <w:t>Kontaktní e-mail = jeden z účastníků</w:t>
       </w:r>
     </w:p>
@@ -543,7 +736,7 @@
         <w:pStyle w:val="Heading1"/>
       </w:pPr>
       <w:r>
-        <w:t>9. Kam se dívat v praxi</w:t>
+        <w:t>10. Kam se dívat v praxi</w:t>
       </w:r>
     </w:p>
     <w:tbl>
@@ -657,7 +850,7 @@
           </w:tcPr>
           <w:p>
             <w:r>
-              <w:t>Dotazy k nabídce 100+ osob</w:t>
+              <w:t>Seznam e-mailů s přístupem</w:t>
             </w:r>
           </w:p>
         </w:tc>
@@ -667,7 +860,7 @@
           </w:tcPr>
           <w:p>
             <w:r>
-              <w:t>info@onlineskoleni.eu</w:t>
+              <w:t>Admin → klik na objednávku → přístupy LMS</w:t>
             </w:r>
           </w:p>
         </w:tc>
@@ -676,10 +869,16 @@
     <w:p/>
     <w:p>
       <w:r>
+        <w:t>Dotazy k nabídce 100+ osob: info@onlineskoleni.eu</w:t>
+      </w:r>
+    </w:p>
+    <w:p/>
+    <w:p>
+      <w:r>
         <w:rPr>
           <w:i/>
         </w:rPr>
-        <w:t>Tento dokument je pro interní použití provozovatele. Není součástí veřejného webu.</w:t>
+        <w:t>Dokument popisuje aktuální chování systému (GoPay hned po platbě; QR notifikace hned při vytvoření + přístupy po Zaplaceno; ruční objednávka přístupy až po Zaplaceno). Je pro interní použití provozovatele — není součástí veřejného webu.</w:t>
       </w:r>
     </w:p>
     <w:sectPr>

</xml_diff>